<commit_message>
Leave <NUM> out of the word clouds
N-grams containing the number placeholder are skipped in the clouds
only; the model keeps <NUM> so words around a number are never joined.
Clouds go back to the Noto Ethiopic font. Report text and figures
updated; all reported results are unchanged (only timings differ).

Co-Authored-By: Claude Opus 5.5 <noreply@anthropic.com>
</commit_message>
<xml_diff>
--- a/report/NLP_Assignment1_Report.docx
+++ b/report/NLP_Assignment1_Report.docx
@@ -20030,7 +20030,7 @@
           <w:sz w:val="18"/>
           <w:szCs w:val="18"/>
         </w:rPr>
-        <w:t xml:space="preserve">Figure 2. Word clouds of the 150 most frequent n-grams, n = 1–4 (left: with stop-words, right: stop-words removed).</w:t>
+        <w:t xml:space="preserve">Figure 2. Word clouds of the 150 most frequent n-grams, n = 1–4 (left: with stop-words, right: stop-words removed). N-grams containing the number placeholder &lt;NUM&gt; are left out of the clouds.</w:t>
       </w:r>
     </w:p>
     <w:p>
@@ -20041,7 +20041,67 @@
         <w:rPr>
           <w:rFonts w:ascii="Calibri" w:cs="Calibri" w:eastAsia="Calibri" w:hAnsi="Calibri"/>
         </w:rPr>
-        <w:t xml:space="preserve">With stop-words the clouds are dominated by grammatical words and date patterns; after removal, named entities and topics (government, people, Addis Ababa, the Prime Minister, parliament, church) become visible.</w:t>
+        <w:t xml:space="preserve">The number placeholder &lt;NUM&gt; stays in the model — dropping it would join words that were never adjacent (“</w:t>
+      </w:r>
+      <w:r>
+        <w:rPr>
+          <w:rFonts w:ascii="Ebrima" w:cs="Ebrima" w:eastAsia="Ebrima" w:hAnsi="Ebrima"/>
+        </w:rPr>
+        <w:t xml:space="preserve">በ</w:t>
+      </w:r>
+      <w:r>
+        <w:rPr>
+          <w:rFonts w:ascii="Calibri" w:cs="Calibri" w:eastAsia="Calibri" w:hAnsi="Calibri"/>
+        </w:rPr>
+        <w:t xml:space="preserve"> 2010 </w:t>
+      </w:r>
+      <w:r>
+        <w:rPr>
+          <w:rFonts w:ascii="Ebrima" w:cs="Ebrima" w:eastAsia="Ebrima" w:hAnsi="Ebrima"/>
+        </w:rPr>
+        <w:t xml:space="preserve">አም</w:t>
+      </w:r>
+      <w:r>
+        <w:rPr>
+          <w:rFonts w:ascii="Calibri" w:cs="Calibri" w:eastAsia="Calibri" w:hAnsi="Calibri"/>
+        </w:rPr>
+        <w:t xml:space="preserve">” would become “</w:t>
+      </w:r>
+      <w:r>
+        <w:rPr>
+          <w:rFonts w:ascii="Ebrima" w:cs="Ebrima" w:eastAsia="Ebrima" w:hAnsi="Ebrima"/>
+        </w:rPr>
+        <w:t xml:space="preserve">በ አም</w:t>
+      </w:r>
+      <w:r>
+        <w:rPr>
+          <w:rFonts w:ascii="Calibri" w:cs="Calibri" w:eastAsia="Calibri" w:hAnsi="Calibri"/>
+        </w:rPr>
+        <w:t xml:space="preserve">”) — but n-grams containing it are left out of the clouds so they show words only. With stop-words the clouds are dominated by grammatical words and date words (</w:t>
+      </w:r>
+      <w:r>
+        <w:rPr>
+          <w:rFonts w:ascii="Ebrima" w:cs="Ebrima" w:eastAsia="Ebrima" w:hAnsi="Ebrima"/>
+        </w:rPr>
+        <w:t xml:space="preserve">ቀን</w:t>
+      </w:r>
+      <w:r>
+        <w:rPr>
+          <w:rFonts w:ascii="Calibri" w:cs="Calibri" w:eastAsia="Calibri" w:hAnsi="Calibri"/>
+        </w:rPr>
+        <w:t xml:space="preserve">, </w:t>
+      </w:r>
+      <w:r>
+        <w:rPr>
+          <w:rFonts w:ascii="Ebrima" w:cs="Ebrima" w:eastAsia="Ebrima" w:hAnsi="Ebrima"/>
+        </w:rPr>
+        <w:t xml:space="preserve">አም</w:t>
+      </w:r>
+      <w:r>
+        <w:rPr>
+          <w:rFonts w:ascii="Calibri" w:cs="Calibri" w:eastAsia="Calibri" w:hAnsi="Calibri"/>
+        </w:rPr>
+        <w:t xml:space="preserve">); after removal, named entities and topics (government, people, Addis Ababa, the Prime Minister, parliament, church) become visible.</w:t>
       </w:r>
     </w:p>
     <w:p>
@@ -31452,7 +31512,7 @@
                 <w:sz w:val="19"/>
                 <w:szCs w:val="19"/>
               </w:rPr>
-              <w:t xml:space="preserve">6.0</w:t>
+              <w:t xml:space="preserve">5.7</w:t>
             </w:r>
           </w:p>
         </w:tc>
@@ -31652,7 +31712,7 @@
                 <w:sz w:val="19"/>
                 <w:szCs w:val="19"/>
               </w:rPr>
-              <w:t xml:space="preserve">10.1</w:t>
+              <w:t xml:space="preserve">9.7</w:t>
             </w:r>
           </w:p>
         </w:tc>
@@ -31852,7 +31912,7 @@
                 <w:sz w:val="19"/>
                 <w:szCs w:val="19"/>
               </w:rPr>
-              <w:t xml:space="preserve">14.3</w:t>
+              <w:t xml:space="preserve">13.9</w:t>
             </w:r>
           </w:p>
         </w:tc>
@@ -32252,7 +32312,7 @@
                 <w:sz w:val="19"/>
                 <w:szCs w:val="19"/>
               </w:rPr>
-              <w:t xml:space="preserve">2.5</w:t>
+              <w:t xml:space="preserve">2.4</w:t>
             </w:r>
           </w:p>
         </w:tc>
@@ -32452,7 +32512,7 @@
                 <w:sz w:val="19"/>
                 <w:szCs w:val="19"/>
               </w:rPr>
-              <w:t xml:space="preserve">3.5</w:t>
+              <w:t xml:space="preserve">3.3</w:t>
             </w:r>
           </w:p>
         </w:tc>

</xml_diff>

<commit_message>
Remove the references page from the report
Co-Authored-By: Claude Opus 5.5 <noreply@anthropic.com>
</commit_message>
<xml_diff>
--- a/report/NLP_Assignment1_Report.docx
+++ b/report/NLP_Assignment1_Report.docx
@@ -965,34 +965,6 @@
     </w:p>
     <w:p>
       <w:pPr>
-        <w:tabs>
-          <w:tab w:val="right" w:pos="9026" w:leader="dot"/>
-        </w:tabs>
-        <w:spacing w:after="80" w:before="80"/>
-        <w:ind w:left="0"/>
-      </w:pPr>
-      <w:r>
-        <w:rPr>
-          <w:rFonts w:ascii="Calibri" w:cs="Calibri" w:eastAsia="Calibri" w:hAnsi="Calibri"/>
-          <w:b/>
-          <w:bCs/>
-          <w:sz w:val="22"/>
-          <w:szCs w:val="22"/>
-        </w:rPr>
-        <w:t xml:space="preserve">References</w:t>
-      </w:r>
-      <w:r>
-        <w:rPr>
-          <w:b/>
-          <w:bCs/>
-          <w:sz w:val="22"/>
-          <w:szCs w:val="22"/>
-        </w:rPr>
-        <w:t xml:space="preserve">	21</w:t>
-      </w:r>
-    </w:p>
-    <w:p>
-      <w:pPr>
         <w:pStyle w:val="Heading1"/>
         <w:pageBreakBefore/>
       </w:pPr>
@@ -32819,73 +32791,6 @@
           <w:rFonts w:ascii="Calibri" w:cs="Calibri" w:eastAsia="Calibri" w:hAnsi="Calibri"/>
         </w:rPr>
         <w:t xml:space="preserve">On 77 M tokens of Amharic, n-gram models behave as theory predicts: higher orders capture more context but suffer from sparsity, unsmoothed and add-one estimates fail, and Kneser-Ney smoothing turns the extra context into steady gains (perplexity 10,682 → 676). The extrinsic tasks confirm the same ranking. Used as a predictive keyboard, a trigram model ranks the intended word in its top five suggestions 33% of the time and saves 52% of keystrokes.</w:t>
-      </w:r>
-    </w:p>
-    <w:p>
-      <w:pPr>
-        <w:pStyle w:val="Heading1"/>
-        <w:pageBreakBefore/>
-      </w:pPr>
-      <w:r>
-        <w:rPr>
-          <w:rFonts w:ascii="Calibri" w:cs="Calibri" w:eastAsia="Calibri" w:hAnsi="Calibri"/>
-        </w:rPr>
-        <w:t xml:space="preserve">References</w:t>
-      </w:r>
-    </w:p>
-    <w:p>
-      <w:pPr>
-        <w:spacing w:after="120" w:line="276"/>
-      </w:pPr>
-      <w:r>
-        <w:rPr>
-          <w:rFonts w:ascii="Calibri" w:cs="Calibri" w:eastAsia="Calibri" w:hAnsi="Calibri"/>
-        </w:rPr>
-        <w:t xml:space="preserve">Gereme, F., Zhu, W., Ayall, T., &amp; Alemu, D. (2021). Combating Fake News in “Low-Resource” Languages: Amharic Fake News Detection Accompanied by Resource Crafting. Information, 12(1), 20. https://doi.org/10.3390/info12010020</w:t>
-      </w:r>
-    </w:p>
-    <w:p>
-      <w:pPr>
-        <w:spacing w:after="120" w:line="276"/>
-      </w:pPr>
-      <w:r>
-        <w:rPr>
-          <w:rFonts w:ascii="Calibri" w:cs="Calibri" w:eastAsia="Calibri" w:hAnsi="Calibri"/>
-        </w:rPr>
-        <w:t xml:space="preserve">Jurafsky, D., &amp; Martin, J. H. (2024). Speech and Language Processing (3rd ed. draft), Chapter 3: N-gram Language Models.</w:t>
-      </w:r>
-    </w:p>
-    <w:p>
-      <w:pPr>
-        <w:spacing w:after="120" w:line="276"/>
-      </w:pPr>
-      <w:r>
-        <w:rPr>
-          <w:rFonts w:ascii="Calibri" w:cs="Calibri" w:eastAsia="Calibri" w:hAnsi="Calibri"/>
-        </w:rPr>
-        <w:t xml:space="preserve">Kneser, R., &amp; Ney, H. (1995). Improved backing-off for M-gram language modeling. Proc. ICASSP, 181–184.</w:t>
-      </w:r>
-    </w:p>
-    <w:p>
-      <w:pPr>
-        <w:spacing w:after="120" w:line="276"/>
-      </w:pPr>
-      <w:r>
-        <w:rPr>
-          <w:rFonts w:ascii="Calibri" w:cs="Calibri" w:eastAsia="Calibri" w:hAnsi="Calibri"/>
-        </w:rPr>
-        <w:t xml:space="preserve">Chen, S. F., &amp; Goodman, J. (1999). An empirical study of smoothing techniques for language modeling. Computer Speech &amp; Language, 13(4), 359–394.</w:t>
-      </w:r>
-    </w:p>
-    <w:p>
-      <w:pPr>
-        <w:spacing w:after="120" w:line="276"/>
-      </w:pPr>
-      <w:r>
-        <w:rPr>
-          <w:rFonts w:ascii="Calibri" w:cs="Calibri" w:eastAsia="Calibri" w:hAnsi="Calibri"/>
-        </w:rPr>
-        <w:t xml:space="preserve">Shannon, C. E. (1948). A Mathematical Theory of Communication. Bell System Technical Journal, 27, 379–423.</w:t>
       </w:r>
     </w:p>
     <w:sectPr>

</xml_diff>